<commit_message>
Update survey proposal with additional research (items 2, 4, 5, 6, 11, 12)
Co-Authored-By: Claude Sonnet 5.5 <noreply@anthropic.com>
Claude-Session: https://claude.ai/code/session_01FzA8EVdw4XpKTibuYFLFga
</commit_message>
<xml_diff>
--- a/韓国メーカー対応可能性調査_提案書_ドラフト.docx
+++ b/韓国メーカー対応可能性調査_提案書_ドラフト.docx
@@ -17,7 +17,7 @@
         <w:rPr>
           <w:b/>
         </w:rPr>
-        <w:t>作成日: 2026年10月29日 / 版: ドラフト第1版</w:t>
+        <w:t>作成日: 2026年10月29日 / 版: ドラフト第2版(追加調査反映)</w:t>
       </w:r>
     </w:p>
     <w:p>
@@ -45,7 +45,7 @@
         <w:rPr>
           <w:b w:val="0"/>
         </w:rPr>
-        <w:t>全17課題のうち、韓国メーカーの候補を公開情報で確認できたのは6課題です(確度が高いのは2課題)。1課題(No.16)は研究機関のみで、残り10課題は韓国メーカーを確認できませんでした。</w:t>
+        <w:t>全17課題のうち、韓国メーカーの候補を公開情報で確認できたのは9課題です(確度が高いのは2課題)。1課題(No.16)は研究機関のみで、残り7課題は韓国メーカーを確認できませんでした。追加調査は課題2、4、5、6、11、12で実施済みです。課題10、13、15、17は未実施です。</w:t>
       </w:r>
     </w:p>
     <w:tbl>
@@ -133,7 +133,7 @@
           </w:tcPr>
           <w:p>
             <w:r>
-              <w:t>確度:中〜低(関連技術は確認、課題との適合は要打合せ)</w:t>
+              <w:t>確度:中(関連製品は確認、課題との適合は要打合せ)</w:t>
             </w:r>
           </w:p>
         </w:tc>
@@ -143,7 +143,7 @@
           </w:tcPr>
           <w:p>
             <w:r>
-              <w:t>1、3、7、14</w:t>
+              <w:t>1、2、3</w:t>
             </w:r>
           </w:p>
         </w:tc>
@@ -153,7 +153,39 @@
           </w:tcPr>
           <w:p>
             <w:r>
-              <w:t>IMT-C、HESOFT、LABCO、ESC修理系3社</w:t>
+              <w:t>IMT-C、Kostek Systems、HESOFT</w:t>
+            </w:r>
+          </w:p>
+        </w:tc>
+      </w:tr>
+      <w:tr>
+        <w:tc>
+          <w:tcPr>
+            <w:tcW w:type="dxa" w:w="5046"/>
+          </w:tcPr>
+          <w:p>
+            <w:r>
+              <w:t>確度:低(周辺技術のみ)</w:t>
+            </w:r>
+          </w:p>
+        </w:tc>
+        <w:tc>
+          <w:tcPr>
+            <w:tcW w:type="dxa" w:w="5046"/>
+          </w:tcPr>
+          <w:p>
+            <w:r>
+              <w:t>4、5、7、14</w:t>
+            </w:r>
+          </w:p>
+        </w:tc>
+        <w:tc>
+          <w:tcPr>
+            <w:tcW w:type="dxa" w:w="5046"/>
+          </w:tcPr>
+          <w:p>
+            <w:r>
+              <w:t>IDeAOcean・Kraver Soft、ITM Semiconductor、LABCO、ESC修理系3社</w:t>
             </w:r>
           </w:p>
         </w:tc>
@@ -197,7 +229,7 @@
           </w:tcPr>
           <w:p>
             <w:r>
-              <w:t>韓国メーカー未確認</w:t>
+              <w:t>韓国メーカー未確認(追加調査済み: 6、11、12)</w:t>
             </w:r>
           </w:p>
         </w:tc>
@@ -207,7 +239,7 @@
           </w:tcPr>
           <w:p>
             <w:r>
-              <w:t>2、4、5、6、10、11、12、13、15、17</w:t>
+              <w:t>6、11、12</w:t>
             </w:r>
           </w:p>
         </w:tc>
@@ -217,7 +249,39 @@
           </w:tcPr>
           <w:p>
             <w:r>
-              <w:t>追加調査(韓国語検索・展示会出展者検索)が必要</w:t>
+              <w:t>韓国語・英語で検索しましたが該当なし</w:t>
+            </w:r>
+          </w:p>
+        </w:tc>
+      </w:tr>
+      <w:tr>
+        <w:tc>
+          <w:tcPr>
+            <w:tcW w:type="dxa" w:w="5046"/>
+          </w:tcPr>
+          <w:p>
+            <w:r>
+              <w:t>韓国メーカー未確認(追加調査は未実施)</w:t>
+            </w:r>
+          </w:p>
+        </w:tc>
+        <w:tc>
+          <w:tcPr>
+            <w:tcW w:type="dxa" w:w="5046"/>
+          </w:tcPr>
+          <w:p>
+            <w:r>
+              <w:t>10、13、15、17</w:t>
+            </w:r>
+          </w:p>
+        </w:tc>
+        <w:tc>
+          <w:tcPr>
+            <w:tcW w:type="dxa" w:w="5046"/>
+          </w:tcPr>
+          <w:p>
+            <w:r>
+              <w:t>追加調査が必要。13は装置名の確認も必要</w:t>
             </w:r>
           </w:p>
         </w:tc>
@@ -501,7 +565,7 @@
               <w:rPr>
                 <w:sz w:val="17"/>
               </w:rPr>
-              <w:t>(韓国メーカー未確認)</w:t>
+              <w:t>Kostek Systems(코스텍시스템 / 平澤 Pyeongtaek)</w:t>
             </w:r>
           </w:p>
         </w:tc>
@@ -514,7 +578,7 @@
               <w:rPr>
                 <w:sz w:val="17"/>
               </w:rPr>
-              <w:t>検索で出たTAZMO、レゾナックは日本企業のため対象外。</w:t>
+              <w:t>仮接着(Temporary Wafer Bonding)・剥離(Wafer De-Bonding)システム、接着フィルムのラミネート工程に対応する装置を公式サイトに掲載。</w:t>
             </w:r>
           </w:p>
         </w:tc>
@@ -527,21 +591,21 @@
               <w:rPr>
                 <w:sz w:val="17"/>
               </w:rPr>
-              <w:t>-</w:t>
+              <w:t>要確認(未確認)</w:t>
             </w:r>
           </w:p>
         </w:tc>
         <w:tc>
           <w:tcPr>
             <w:tcW w:type="dxa" w:w="737"/>
-            <w:shd w:val="clear" w:color="auto" w:fill="D9D9D9"/>
+            <w:shd w:val="clear" w:color="auto" w:fill="FFF2CC"/>
           </w:tcPr>
           <w:p>
             <w:r>
               <w:rPr>
                 <w:sz w:val="17"/>
               </w:rPr>
-              <w:t>未確認</w:t>
+              <w:t>中</w:t>
             </w:r>
           </w:p>
         </w:tc>
@@ -554,7 +618,7 @@
               <w:rPr>
                 <w:sz w:val="17"/>
               </w:rPr>
-              <w:t>追加調査要(仮接着・剥離装置の韓国メーカー)。</w:t>
+              <w:t>ウエハ・キャリア向けの装置であり、センサーへの薄膜フィルム搭載・剥離に使えるかは要打合せ。【参考】TAZMO、AIMECHATEC、レゾナックは日本企業、EV Groupはオーストリア企業のため対象外。</w:t>
             </w:r>
           </w:p>
         </w:tc>
@@ -689,7 +753,7 @@
               <w:rPr>
                 <w:sz w:val="17"/>
               </w:rPr>
-              <w:t>(韓国メーカー未確認)</w:t>
+              <w:t>IDeAOcean(아이디어오션 / ソウル)、Kraver Soft(크레이버소프트)</w:t>
             </w:r>
           </w:p>
         </w:tc>
@@ -702,7 +766,7 @@
               <w:rPr>
                 <w:sz w:val="17"/>
               </w:rPr>
-              <w:t>-</w:t>
+              <w:t>IDeAOcean: 機械設計AIエージェント「METHEUS」(2023年設立、2026年9月オープンベータ開始。2026年10月、東京の CDFAM Tokyo 2026 で発表)。Kraver Soft: 3D CADベースの機械部品設計ソフトと自動化サービス(Tracxn記載)。</w:t>
             </w:r>
           </w:p>
         </w:tc>
@@ -715,21 +779,21 @@
               <w:rPr>
                 <w:sz w:val="17"/>
               </w:rPr>
-              <w:t>-</w:t>
+              <w:t>IDeAOcean: 東京でのイベント登壇は確認できたが、日本法人・代理店は未確認。Kraver Soft: 未確認</w:t>
             </w:r>
           </w:p>
         </w:tc>
         <w:tc>
           <w:tcPr>
             <w:tcW w:type="dxa" w:w="737"/>
-            <w:shd w:val="clear" w:color="auto" w:fill="D9D9D9"/>
+            <w:shd w:val="clear" w:color="auto" w:fill="FCE4D6"/>
           </w:tcPr>
           <w:p>
             <w:r>
               <w:rPr>
                 <w:sz w:val="17"/>
               </w:rPr>
-              <w:t>未確認</w:t>
+              <w:t>低</w:t>
             </w:r>
           </w:p>
         </w:tc>
@@ -742,7 +806,7 @@
               <w:rPr>
                 <w:sz w:val="17"/>
               </w:rPr>
-              <w:t>追加調査要。</w:t>
+              <w:t>METHEUSはリンク機構設計が中心のため、装置メカ部品への適合は要確認。Kraver Softは従業員数1名の登録情報のみで、実態は要確認。【参考】Maru Internationalは IRONCAD の販売会社でありメーカーではありません。</w:t>
             </w:r>
           </w:p>
         </w:tc>
@@ -783,7 +847,7 @@
               <w:rPr>
                 <w:sz w:val="17"/>
               </w:rPr>
-              <w:t>(韓国メーカー未確認)</w:t>
+              <w:t>ITM Semiconductor(アイティーエム セミコンダクター)</w:t>
             </w:r>
           </w:p>
         </w:tc>
@@ -796,7 +860,7 @@
               <w:rPr>
                 <w:sz w:val="17"/>
               </w:rPr>
-              <w:t>低照度カメラモジュールの韓国メーカーは特定できず。</w:t>
+              <w:t>近接・照度センサ、赤外線センサ等のMEMS・光センサモジュールの韓国メーカー(公式サイト)。微弱光検出用の専用品は確認できず。</w:t>
             </w:r>
           </w:p>
         </w:tc>
@@ -809,21 +873,21 @@
               <w:rPr>
                 <w:sz w:val="17"/>
               </w:rPr>
-              <w:t>-</w:t>
+              <w:t>未確認</w:t>
             </w:r>
           </w:p>
         </w:tc>
         <w:tc>
           <w:tcPr>
             <w:tcW w:type="dxa" w:w="737"/>
-            <w:shd w:val="clear" w:color="auto" w:fill="D9D9D9"/>
+            <w:shd w:val="clear" w:color="auto" w:fill="FCE4D6"/>
           </w:tcPr>
           <w:p>
             <w:r>
               <w:rPr>
                 <w:sz w:val="17"/>
               </w:rPr>
-              <w:t>未確認</w:t>
+              <w:t>低</w:t>
             </w:r>
           </w:p>
         </w:tc>
@@ -836,7 +900,7 @@
               <w:rPr>
                 <w:sz w:val="17"/>
               </w:rPr>
-              <w:t>追加調査要(低照度センサモジュール)。</w:t>
+              <w:t>【参考】Viva Techは光検出器(フォトダイオード、APD、SiPM、PMT)を扱うが、浜松ホトニクス製品の韓国販売会社であり、韓国メーカーではありません。微弱光検出の要件(波長・感度)を整理後に再調査。</w:t>
             </w:r>
           </w:p>
         </w:tc>
@@ -890,7 +954,7 @@
               <w:rPr>
                 <w:sz w:val="17"/>
               </w:rPr>
-              <w:t>Baumer、JAIは韓国現地法人であり韓国メーカーではないため対象外。</w:t>
+              <w:t>追加調査済み(韓国語・英語で検索)。Baumer、JAIは外資の韓国現地法人、SP情報技術(에스피정보기술)は海外製特殊カメラの販売会社であり、いずれも韓国メーカーではないため対象外。</w:t>
             </w:r>
           </w:p>
         </w:tc>
@@ -930,7 +994,7 @@
               <w:rPr>
                 <w:sz w:val="17"/>
               </w:rPr>
-              <w:t>追加調査要(防水・耐水・高速カメラ)。</w:t>
+              <w:t>耐水・耐粉じん・高速録画の要件を整理して再調査。</w:t>
             </w:r>
           </w:p>
         </w:tc>
@@ -1360,7 +1424,7 @@
               <w:rPr>
                 <w:sz w:val="17"/>
               </w:rPr>
-              <w:t>京セラのレンズ蓋用遮光封止樹脂は日本企業のため対象外。</w:t>
+              <w:t>追加調査済み(該当なし)。京セラのレンズ蓋用遮光封止樹脂、住友ベークライトは日本企業のため対象外。</w:t>
             </w:r>
           </w:p>
         </w:tc>
@@ -1454,7 +1518,7 @@
               <w:rPr>
                 <w:sz w:val="17"/>
               </w:rPr>
-              <w:t>検索で出たミラプロ、富士高圧フレキシブルホース、南国フレキ工業は日本企業のため対象外。</w:t>
+              <w:t>追加調査済み(該当なし)。検索で出たミラプロ、富士高圧フレキシブルホース、南国フレキ工業は日本企業のため対象外。</w:t>
             </w:r>
           </w:p>
         </w:tc>
@@ -1494,7 +1558,7 @@
               <w:rPr>
                 <w:sz w:val="17"/>
               </w:rPr>
-              <w:t>追加調査要。</w:t>
+              <w:t>韓国語での追加検索が必要。</w:t>
             </w:r>
           </w:p>
         </w:tc>
@@ -1994,7 +2058,7 @@
         <w:pStyle w:val="ListNumber"/>
       </w:pPr>
       <w:r>
-        <w:t>確度「中」の課題(No.1、3)は、サンプル評価またはデモの依頼から開始する。</w:t>
+        <w:t>確度「中」の課題(No.1、2、3)は、サンプル評価またはデモの依頼から開始する。</w:t>
       </w:r>
     </w:p>
     <w:p>
@@ -2002,7 +2066,7 @@
         <w:pStyle w:val="ListNumber"/>
       </w:pPr>
       <w:r>
-        <w:t>確度「低」の課題(No.7、14、16)は、要件の再整理後に、メーカーへの技術相談か共同検討として進める。</w:t>
+        <w:t>確度「低」の課題(No.4、5、7、14、16)は、要件の再整理後に、メーカーへの技術相談か共同検討として進める。</w:t>
       </w:r>
     </w:p>
     <w:p>
@@ -2010,7 +2074,7 @@
         <w:pStyle w:val="ListNumber"/>
       </w:pPr>
       <w:r>
-        <w:t>韓国メーカー未確認の10課題は、韓国語検索、SEMICON Korea 出展者名簿、KOTRA、韓国半導体産業協会(KSIA)経由で追加調査する。</w:t>
+        <w:t>韓国メーカー未確認の7課題(6、10、11、12、13、15、17)は、未実施の課題(10、13、15、17)の調査を優先し、韓国語検索、SEMICON Korea 出展者名簿、KOTRA、韓国半導体産業協会(KSIA)経由で調査する。</w:t>
       </w:r>
     </w:p>
     <w:p>
@@ -2069,7 +2133,15 @@
         <w:pStyle w:val="ListBullet"/>
       </w:pPr>
       <w:r>
-        <w:t>LABCO 公式サイト、HESOFT 公式サイト告知(2020年)、Tracxn(IMT-C 企業情報)</w:t>
+        <w:t>LABCO 公式サイト、HESOFT 公式サイト告知(2020年)、Tracxn(IMT-C、Kraver Soft 企業情報)</w:t>
+      </w:r>
+    </w:p>
+    <w:p>
+      <w:pPr>
+        <w:pStyle w:val="ListBullet"/>
+      </w:pPr>
+      <w:r>
+        <w:t>Kostek Systems 公式サイト、IDeAOcean 公式サイト・LinkedIn、ITM Semiconductor 公式サイト、Viva Tech 公式サイト</w:t>
       </w:r>
     </w:p>
     <w:p>

</xml_diff>

<commit_message>
Update survey proposal with research on items 10, 15, 17
Co-Authored-By: Claude Sonnet 5.5 <noreply@anthropic.com>
Claude-Session: https://claude.ai/code/session_01FzA8EVdw4XpKTibuYFLFga
</commit_message>
<xml_diff>
--- a/韓国メーカー対応可能性調査_提案書_ドラフト.docx
+++ b/韓国メーカー対応可能性調査_提案書_ドラフト.docx
@@ -17,7 +17,7 @@
         <w:rPr>
           <w:b/>
         </w:rPr>
-        <w:t>作成日: 2026年10月29日 / 版: ドラフト第2版(追加調査反映)</w:t>
+        <w:t>作成日: 2026年10月29日 / 版: ドラフト第3版(最終報告用・追加調査反映)</w:t>
       </w:r>
     </w:p>
     <w:p>
@@ -45,7 +45,7 @@
         <w:rPr>
           <w:b w:val="0"/>
         </w:rPr>
-        <w:t>全17課題のうち、韓国メーカーの候補を公開情報で確認できたのは9課題です(確度が高いのは2課題)。1課題(No.16)は研究機関のみで、残り7課題は韓国メーカーを確認できませんでした。追加調査は課題2、4、5、6、11、12で実施済みです。課題10、13、15、17は未実施です。</w:t>
+        <w:t>全17課題のうち、韓国メーカーの候補を公開情報で確認できたのは12課題です(確度が高いのは2課題)。1課題(No.16)は研究機関のみで、残り4課題(6、11、12、13)は韓国メーカーを確認できませんでした。課題13は装置名が不明なため調査できていません。</w:t>
       </w:r>
     </w:p>
     <w:tbl>
@@ -143,7 +143,7 @@
           </w:tcPr>
           <w:p>
             <w:r>
-              <w:t>1、2、3</w:t>
+              <w:t>1、2、3、17</w:t>
             </w:r>
           </w:p>
         </w:tc>
@@ -153,7 +153,7 @@
           </w:tcPr>
           <w:p>
             <w:r>
-              <w:t>IMT-C、Kostek Systems、HESOFT</w:t>
+              <w:t>IMT-C、Kostek Systems、HESOFT、Youngsung Multitech</w:t>
             </w:r>
           </w:p>
         </w:tc>
@@ -175,7 +175,7 @@
           </w:tcPr>
           <w:p>
             <w:r>
-              <w:t>4、5、7、14</w:t>
+              <w:t>4、5、7、10、14、15</w:t>
             </w:r>
           </w:p>
         </w:tc>
@@ -185,7 +185,7 @@
           </w:tcPr>
           <w:p>
             <w:r>
-              <w:t>IDeAOcean・Kraver Soft、ITM Semiconductor、LABCO、ESC修理系3社</w:t>
+              <w:t>IDeAOcean・Kraver Soft、ITM Semiconductor、LABCO、BMT・3SLINE・ASFLOW、ESC修理系3社、AUROS(周辺)</w:t>
             </w:r>
           </w:p>
         </w:tc>
@@ -229,7 +229,7 @@
           </w:tcPr>
           <w:p>
             <w:r>
-              <w:t>韓国メーカー未確認(追加調査済み: 6、11、12)</w:t>
+              <w:t>韓国メーカー未確認</w:t>
             </w:r>
           </w:p>
         </w:tc>
@@ -239,7 +239,7 @@
           </w:tcPr>
           <w:p>
             <w:r>
-              <w:t>6、11、12</w:t>
+              <w:t>6、11、12、13</w:t>
             </w:r>
           </w:p>
         </w:tc>
@@ -249,39 +249,7 @@
           </w:tcPr>
           <w:p>
             <w:r>
-              <w:t>韓国語・英語で検索しましたが該当なし</w:t>
-            </w:r>
-          </w:p>
-        </w:tc>
-      </w:tr>
-      <w:tr>
-        <w:tc>
-          <w:tcPr>
-            <w:tcW w:type="dxa" w:w="5046"/>
-          </w:tcPr>
-          <w:p>
-            <w:r>
-              <w:t>韓国メーカー未確認(追加調査は未実施)</w:t>
-            </w:r>
-          </w:p>
-        </w:tc>
-        <w:tc>
-          <w:tcPr>
-            <w:tcW w:type="dxa" w:w="5046"/>
-          </w:tcPr>
-          <w:p>
-            <w:r>
-              <w:t>10、13、15、17</w:t>
-            </w:r>
-          </w:p>
-        </w:tc>
-        <w:tc>
-          <w:tcPr>
-            <w:tcW w:type="dxa" w:w="5046"/>
-          </w:tcPr>
-          <w:p>
-            <w:r>
-              <w:t>追加調査が必要。13は装置名の確認も必要</w:t>
+              <w:t>6、11、12は韓国語・英語で検索しましたが該当なし。13は装置名が不明で調査できていません</w:t>
             </w:r>
           </w:p>
         </w:tc>
@@ -1317,7 +1285,7 @@
               <w:rPr>
                 <w:sz w:val="17"/>
               </w:rPr>
-              <w:t>(韓国メーカー未確認)</w:t>
+              <w:t>BMT(SUPERLOK / 釜山)、ASFLOW、3SLINE(원주 / 原州)</w:t>
             </w:r>
           </w:p>
         </w:tc>
@@ -1330,7 +1298,7 @@
               <w:rPr>
                 <w:sz w:val="17"/>
               </w:rPr>
-              <w:t>-</w:t>
+              <w:t>いずれも半導体向け配管部材の韓国メーカー。BMT: UHPフィッティング・バルブ・ガス供給パネル(サムスン電子、SKハイニックスの認定を公式サイトに記載)。3SLINE: PFA製の薬液配管部材・逆流防止バルブ。ASFLOW: 高純度配管部品。</w:t>
             </w:r>
           </w:p>
         </w:tc>
@@ -1343,21 +1311,21 @@
               <w:rPr>
                 <w:sz w:val="17"/>
               </w:rPr>
-              <w:t>-</w:t>
+              <w:t>未確認</w:t>
             </w:r>
           </w:p>
         </w:tc>
         <w:tc>
           <w:tcPr>
             <w:tcW w:type="dxa" w:w="737"/>
-            <w:shd w:val="clear" w:color="auto" w:fill="D9D9D9"/>
+            <w:shd w:val="clear" w:color="auto" w:fill="FCE4D6"/>
           </w:tcPr>
           <w:p>
             <w:r>
               <w:rPr>
                 <w:sz w:val="17"/>
               </w:rPr>
-              <w:t>未確認</w:t>
+              <w:t>低</w:t>
             </w:r>
           </w:p>
         </w:tc>
@@ -1370,7 +1338,7 @@
               <w:rPr>
                 <w:sz w:val="17"/>
               </w:rPr>
-              <w:t>追加調査要。</w:t>
+              <w:t>誤接続防止(キー付きコネクタ等)を製品として確認できたメーカーはなし。配管部材メーカーとしての共同開発候補。【参考】Entegris(ErgoNOW)、Staubliは外資のため対象外。BAEKSAN ENGは配管施工会社。</w:t>
             </w:r>
           </w:p>
         </w:tc>
@@ -1787,7 +1755,7 @@
               <w:rPr>
                 <w:sz w:val="17"/>
               </w:rPr>
-              <w:t>(韓国メーカー未確認)</w:t>
+              <w:t>(専用品は韓国メーカー未確認)。周辺技術: AUROS Technology</w:t>
             </w:r>
           </w:p>
         </w:tc>
@@ -1800,7 +1768,7 @@
               <w:rPr>
                 <w:sz w:val="17"/>
               </w:rPr>
-              <w:t>-</w:t>
+              <w:t>AUROSは300mm 3D高さ計測装置 MT-30T(2025年5月発表)など、パッケージ・ウエハ向け計測装置を保有(公式サイト)。回り込み成膜の計測への適合は不明。</w:t>
             </w:r>
           </w:p>
         </w:tc>
@@ -1813,21 +1781,21 @@
               <w:rPr>
                 <w:sz w:val="17"/>
               </w:rPr>
-              <w:t>-</w:t>
+              <w:t>AUROS JAPAN 東京支店(課題8と同じ)</w:t>
             </w:r>
           </w:p>
         </w:tc>
         <w:tc>
           <w:tcPr>
             <w:tcW w:type="dxa" w:w="737"/>
-            <w:shd w:val="clear" w:color="auto" w:fill="D9D9D9"/>
+            <w:shd w:val="clear" w:color="auto" w:fill="FCE4D6"/>
           </w:tcPr>
           <w:p>
             <w:r>
               <w:rPr>
                 <w:sz w:val="17"/>
               </w:rPr>
-              <w:t>未確認</w:t>
+              <w:t>低</w:t>
             </w:r>
           </w:p>
         </w:tc>
@@ -1840,7 +1808,7 @@
               <w:rPr>
                 <w:sz w:val="17"/>
               </w:rPr>
-              <w:t>追加調査要。</w:t>
+              <w:t>適合性は未確認のため、技術相談の位置づけ。ほかに、国内メーカー製の膜厚計測装置は確認できず。</w:t>
             </w:r>
           </w:p>
         </w:tc>
@@ -1975,7 +1943,7 @@
               <w:rPr>
                 <w:sz w:val="17"/>
               </w:rPr>
-              <w:t>(韓国メーカー未確認)</w:t>
+              <w:t>Youngsung Multitech(영성멀티텍 / 華城)</w:t>
             </w:r>
           </w:p>
         </w:tc>
@@ -1988,7 +1956,7 @@
               <w:rPr>
                 <w:sz w:val="17"/>
               </w:rPr>
-              <w:t>-</w:t>
+              <w:t>半導体・ディスプレイ装置向けの精密部品加工、設備セットアップ用の治具(Fixture等)の設計・製造。三次元測定機、Heリークディテクターを保有(公式サイト)。</w:t>
             </w:r>
           </w:p>
         </w:tc>
@@ -2001,21 +1969,21 @@
               <w:rPr>
                 <w:sz w:val="17"/>
               </w:rPr>
-              <w:t>-</w:t>
+              <w:t>未確認</w:t>
             </w:r>
           </w:p>
         </w:tc>
         <w:tc>
           <w:tcPr>
             <w:tcW w:type="dxa" w:w="737"/>
-            <w:shd w:val="clear" w:color="auto" w:fill="D9D9D9"/>
+            <w:shd w:val="clear" w:color="auto" w:fill="FFF2CC"/>
           </w:tcPr>
           <w:p>
             <w:r>
               <w:rPr>
                 <w:sz w:val="17"/>
               </w:rPr>
-              <w:t>未確認</w:t>
+              <w:t>中</w:t>
             </w:r>
           </w:p>
         </w:tc>
@@ -2028,7 +1996,7 @@
               <w:rPr>
                 <w:sz w:val="17"/>
               </w:rPr>
-              <w:t>追加調査要。専用治具のため、装置メーカー(PVD)と調整が必要な可能性。</w:t>
+              <w:t>治具の製作会社であり、測定機能そのものは提案できません。装置メーカー(PVD)側の仕様確認が必要。</w:t>
             </w:r>
           </w:p>
         </w:tc>
@@ -2058,7 +2026,7 @@
         <w:pStyle w:val="ListNumber"/>
       </w:pPr>
       <w:r>
-        <w:t>確度「中」の課題(No.1、2、3)は、サンプル評価またはデモの依頼から開始する。</w:t>
+        <w:t>確度「中」の課題(No.1、2、3、17)は、サンプル評価またはデモの依頼から開始する。</w:t>
       </w:r>
     </w:p>
     <w:p>
@@ -2066,7 +2034,7 @@
         <w:pStyle w:val="ListNumber"/>
       </w:pPr>
       <w:r>
-        <w:t>確度「低」の課題(No.4、5、7、14、16)は、要件の再整理後に、メーカーへの技術相談か共同検討として進める。</w:t>
+        <w:t>確度「低」の課題(No.4、5、7、10、14、15、16)は、要件の再整理後に、メーカーへの技術相談か共同検討として進める。</w:t>
       </w:r>
     </w:p>
     <w:p>
@@ -2074,7 +2042,7 @@
         <w:pStyle w:val="ListNumber"/>
       </w:pPr>
       <w:r>
-        <w:t>韓国メーカー未確認の7課題(6、10、11、12、13、15、17)は、未実施の課題(10、13、15、17)の調査を優先し、韓国語検索、SEMICON Korea 出展者名簿、KOTRA、韓国半導体産業協会(KSIA)経由で調査する。</w:t>
+        <w:t>韓国メーカー未確認の4課題(6、11、12、13)は、SEMICON Korea 出展者名簿、KOTRA、韓国半導体産業協会(KSIA)経由で追加調査する。</w:t>
       </w:r>
     </w:p>
     <w:p>
@@ -2142,6 +2110,14 @@
       </w:pPr>
       <w:r>
         <w:t>Kostek Systems 公式サイト、IDeAOcean 公式サイト・LinkedIn、ITM Semiconductor 公式サイト、Viva Tech 公式サイト</w:t>
+      </w:r>
+    </w:p>
+    <w:p>
+      <w:pPr>
+        <w:pStyle w:val="ListBullet"/>
+      </w:pPr>
+      <w:r>
+        <w:t>BMT(SEMICON Korea 2026 出展情報)、3SLINE(同)、ASFLOW(Komachine)、Youngsung Multitech 公式サイト</w:t>
       </w:r>
     </w:p>
     <w:p>

</xml_diff>